<commit_message>
Draw lattice patterns as regular hexagons and align Fig 5D with the grid
- figures/hex_plot.py: draw fields in a regular hexagonal window (cells
  within hex distance 11 of the centre, indices wrapped periodically; 397
  distinct cells on the 24 x 24 lattice) instead of the full rhombus.
- Fig 1B, 1C: hexagonal patches for the contact neighbourhood and the
  three-sublattice mode.
- Fig 5D: occupies the same grid cell as panels A-C, so its label and
  title line up; the two final fields sit side by side above a horizontal
  colour bar.
- Colour bars no longer inherit grid lines from the axes style.
- Manuscript rebuilt; Fig 5D caption notes the hexagonal window.
</commit_message>
<xml_diff>
--- a/manuscript/manuscript_revised.docx
+++ b/manuscript/manuscript_revised.docx
@@ -19415,9 +19415,9 @@
       <w:r>
         <w:drawing>
           <wp:inline>
-            <wp:extent cx="5334000" cy="4578041"/>
+            <wp:extent cx="5334000" cy="4786781"/>
             <wp:effectExtent b="0" l="0" r="0" t="0"/>
-            <wp:docPr descr="Figure 5. The explicit downstream layer sets the tempo, not the onset. (A) Growth rate of the \mu=-3 mode at P2 along the family (\lambda_S,d_S)\to\alpha(\lambda_S,d_S), which leaves every steady state, every G(\mu) and \lambda_N^c unchanged. Dashed: slow-proneural limit d_S[G(-3)-1]. Horizontal lines: matched DNA and DN reductions. (B) Growth rate of the DNA reduction against the full model at all 1453 global-sample points where both are unstable. Dashed line: equal rates. (C) Nonlinear simulations at P2. Amplitude of the three-sublattice component of D (relative to D^*), for the full model and the DNA reduction, each started on its own exact eigenvector. Shaded spans: prespecified fitting windows. Dashed lines: predicted growth. (D) Final Delta fields of the two simulations, which coincide." title="" id="1" name="Picture"/>
+            <wp:docPr descr="Figure 5. The explicit downstream layer sets the tempo, not the onset. (A) Growth rate of the \mu=-3 mode at P2 along the family (\lambda_S,d_S)\to\alpha(\lambda_S,d_S), which leaves every steady state, every G(\mu) and \lambda_N^c unchanged. Dashed: slow-proneural limit d_S[G(-3)-1]. Horizontal lines: matched DNA and DN reductions. (B) Growth rate of the DNA reduction against the full model at all 1453 global-sample points where both are unstable. Dashed line: equal rates. (C) Nonlinear simulations at P2. Amplitude of the three-sublattice component of D (relative to D^*), for the full model and the DNA reduction, each started on its own exact eigenvector. Shaded spans: prespecified fitting windows. Dashed lines: predicted growth. (D) Final Delta fields of the two simulations, shown in a hexagonal window of 397 of the 576 cells of the periodic lattice. The two fields coincide." title="" id="1" name="Picture"/>
             <a:graphic>
               <a:graphicData uri="http://schemas.openxmlformats.org/drawingml/2006/picture">
                 <pic:pic>
@@ -19436,7 +19436,7 @@
                   <pic:spPr bwMode="auto">
                     <a:xfrm>
                       <a:off x="0" y="0"/>
-                      <a:ext cx="5334000" cy="4578041"/>
+                      <a:ext cx="5334000" cy="4786781"/>
                     </a:xfrm>
                     <a:prstGeom prst="rect">
                       <a:avLst/>
@@ -19759,7 +19759,7 @@
         </m:sSup>
       </m:oMath>
       <w:r>
-        <w:t xml:space="preserve">), for the full model and the DNA reduction, each started on its own exact eigenvector. Shaded spans: prespecified fitting windows. Dashed lines: predicted growth. (D) Final Delta fields of the two simulations, which coincide.</w:t>
+        <w:t xml:space="preserve">), for the full model and the DNA reduction, each started on its own exact eigenvector. Shaded spans: prespecified fitting windows. Dashed lines: predicted growth. (D) Final Delta fields of the two simulations, shown in a hexagonal window of 397 of the 576 cells of the periodic lattice. The two fields coincide.</w:t>
       </w:r>
     </w:p>
     <w:p>

</xml_diff>